<commit_message>
docs: restyle final report diagrams
</commit_message>
<xml_diff>
--- a/docs/结项报告_刘剑宇个人版_图表数据库增强版.docx
+++ b/docs/结项报告_刘剑宇个人版_图表数据库增强版.docx
@@ -399,7 +399,7 @@
           <w:tcPr>
             <w:tcW w:type="dxa" w:w="3126"/>
             <w:vAlign w:val="center"/>
-            <w:shd w:fill="EAF2F8"/>
+            <w:shd w:fill="F2F2F2"/>
           </w:tcPr>
           <w:p>
             <w:pPr>
@@ -420,7 +420,7 @@
           <w:tcPr>
             <w:tcW w:type="dxa" w:w="3126"/>
             <w:vAlign w:val="center"/>
-            <w:shd w:fill="EAF2F8"/>
+            <w:shd w:fill="F2F2F2"/>
           </w:tcPr>
           <w:p>
             <w:pPr>
@@ -441,7 +441,7 @@
           <w:tcPr>
             <w:tcW w:type="dxa" w:w="3126"/>
             <w:vAlign w:val="center"/>
-            <w:shd w:fill="EAF2F8"/>
+            <w:shd w:fill="F2F2F2"/>
           </w:tcPr>
           <w:p>
             <w:pPr>
@@ -1043,7 +1043,7 @@
           <w:tcPr>
             <w:tcW w:type="dxa" w:w="2344"/>
             <w:vAlign w:val="center"/>
-            <w:shd w:fill="EAF2F8"/>
+            <w:shd w:fill="F2F2F2"/>
           </w:tcPr>
           <w:p>
             <w:pPr>
@@ -1064,7 +1064,7 @@
           <w:tcPr>
             <w:tcW w:type="dxa" w:w="2344"/>
             <w:vAlign w:val="center"/>
-            <w:shd w:fill="EAF2F8"/>
+            <w:shd w:fill="F2F2F2"/>
           </w:tcPr>
           <w:p>
             <w:pPr>
@@ -1085,7 +1085,7 @@
           <w:tcPr>
             <w:tcW w:type="dxa" w:w="2344"/>
             <w:vAlign w:val="center"/>
-            <w:shd w:fill="EAF2F8"/>
+            <w:shd w:fill="F2F2F2"/>
           </w:tcPr>
           <w:p>
             <w:pPr>
@@ -1106,7 +1106,7 @@
           <w:tcPr>
             <w:tcW w:type="dxa" w:w="2344"/>
             <w:vAlign w:val="center"/>
-            <w:shd w:fill="EAF2F8"/>
+            <w:shd w:fill="F2F2F2"/>
           </w:tcPr>
           <w:p>
             <w:pPr>
@@ -2402,7 +2402,7 @@
           <w:tcPr>
             <w:tcW w:type="dxa" w:w="2344"/>
             <w:vAlign w:val="center"/>
-            <w:shd w:fill="EAF2F8"/>
+            <w:shd w:fill="F2F2F2"/>
           </w:tcPr>
           <w:p>
             <w:pPr>
@@ -2423,7 +2423,7 @@
           <w:tcPr>
             <w:tcW w:type="dxa" w:w="2344"/>
             <w:vAlign w:val="center"/>
-            <w:shd w:fill="EAF2F8"/>
+            <w:shd w:fill="F2F2F2"/>
           </w:tcPr>
           <w:p>
             <w:pPr>
@@ -2444,7 +2444,7 @@
           <w:tcPr>
             <w:tcW w:type="dxa" w:w="2344"/>
             <w:vAlign w:val="center"/>
-            <w:shd w:fill="EAF2F8"/>
+            <w:shd w:fill="F2F2F2"/>
           </w:tcPr>
           <w:p>
             <w:pPr>
@@ -2465,7 +2465,7 @@
           <w:tcPr>
             <w:tcW w:type="dxa" w:w="2344"/>
             <w:vAlign w:val="center"/>
-            <w:shd w:fill="EAF2F8"/>
+            <w:shd w:fill="F2F2F2"/>
           </w:tcPr>
           <w:p>
             <w:pPr>
@@ -3351,7 +3351,7 @@
           <w:tcPr>
             <w:tcW w:type="dxa" w:w="2344"/>
             <w:vAlign w:val="center"/>
-            <w:shd w:fill="EAF2F8"/>
+            <w:shd w:fill="F2F2F2"/>
           </w:tcPr>
           <w:p>
             <w:pPr>
@@ -3372,7 +3372,7 @@
           <w:tcPr>
             <w:tcW w:type="dxa" w:w="2344"/>
             <w:vAlign w:val="center"/>
-            <w:shd w:fill="EAF2F8"/>
+            <w:shd w:fill="F2F2F2"/>
           </w:tcPr>
           <w:p>
             <w:pPr>
@@ -3393,7 +3393,7 @@
           <w:tcPr>
             <w:tcW w:type="dxa" w:w="2344"/>
             <w:vAlign w:val="center"/>
-            <w:shd w:fill="EAF2F8"/>
+            <w:shd w:fill="F2F2F2"/>
           </w:tcPr>
           <w:p>
             <w:pPr>
@@ -3414,7 +3414,7 @@
           <w:tcPr>
             <w:tcW w:type="dxa" w:w="2344"/>
             <w:vAlign w:val="center"/>
-            <w:shd w:fill="EAF2F8"/>
+            <w:shd w:fill="F2F2F2"/>
           </w:tcPr>
           <w:p>
             <w:pPr>
@@ -3889,7 +3889,7 @@
           <w:tcPr>
             <w:tcW w:type="dxa" w:w="3126"/>
             <w:vAlign w:val="center"/>
-            <w:shd w:fill="EAF2F8"/>
+            <w:shd w:fill="F2F2F2"/>
           </w:tcPr>
           <w:p>
             <w:pPr>
@@ -3910,7 +3910,7 @@
           <w:tcPr>
             <w:tcW w:type="dxa" w:w="3126"/>
             <w:vAlign w:val="center"/>
-            <w:shd w:fill="EAF2F8"/>
+            <w:shd w:fill="F2F2F2"/>
           </w:tcPr>
           <w:p>
             <w:pPr>
@@ -3931,7 +3931,7 @@
           <w:tcPr>
             <w:tcW w:type="dxa" w:w="3126"/>
             <w:vAlign w:val="center"/>
-            <w:shd w:fill="EAF2F8"/>
+            <w:shd w:fill="F2F2F2"/>
           </w:tcPr>
           <w:p>
             <w:pPr>
@@ -4693,7 +4693,7 @@
           <w:tcPr>
             <w:tcW w:type="dxa" w:w="2344"/>
             <w:vAlign w:val="center"/>
-            <w:shd w:fill="EAF2F8"/>
+            <w:shd w:fill="F2F2F2"/>
           </w:tcPr>
           <w:p>
             <w:pPr>
@@ -4714,7 +4714,7 @@
           <w:tcPr>
             <w:tcW w:type="dxa" w:w="2344"/>
             <w:vAlign w:val="center"/>
-            <w:shd w:fill="EAF2F8"/>
+            <w:shd w:fill="F2F2F2"/>
           </w:tcPr>
           <w:p>
             <w:pPr>
@@ -4735,7 +4735,7 @@
           <w:tcPr>
             <w:tcW w:type="dxa" w:w="2344"/>
             <w:vAlign w:val="center"/>
-            <w:shd w:fill="EAF2F8"/>
+            <w:shd w:fill="F2F2F2"/>
           </w:tcPr>
           <w:p>
             <w:pPr>
@@ -4756,7 +4756,7 @@
           <w:tcPr>
             <w:tcW w:type="dxa" w:w="2344"/>
             <w:vAlign w:val="center"/>
-            <w:shd w:fill="EAF2F8"/>
+            <w:shd w:fill="F2F2F2"/>
           </w:tcPr>
           <w:p>
             <w:pPr>
@@ -5382,7 +5382,7 @@
           <w:tcPr>
             <w:tcW w:type="dxa" w:w="2344"/>
             <w:vAlign w:val="center"/>
-            <w:shd w:fill="EAF2F8"/>
+            <w:shd w:fill="F2F2F2"/>
           </w:tcPr>
           <w:p>
             <w:pPr>
@@ -5403,7 +5403,7 @@
           <w:tcPr>
             <w:tcW w:type="dxa" w:w="2344"/>
             <w:vAlign w:val="center"/>
-            <w:shd w:fill="EAF2F8"/>
+            <w:shd w:fill="F2F2F2"/>
           </w:tcPr>
           <w:p>
             <w:pPr>
@@ -5424,7 +5424,7 @@
           <w:tcPr>
             <w:tcW w:type="dxa" w:w="2344"/>
             <w:vAlign w:val="center"/>
-            <w:shd w:fill="EAF2F8"/>
+            <w:shd w:fill="F2F2F2"/>
           </w:tcPr>
           <w:p>
             <w:pPr>
@@ -5445,7 +5445,7 @@
           <w:tcPr>
             <w:tcW w:type="dxa" w:w="2344"/>
             <w:vAlign w:val="center"/>
-            <w:shd w:fill="EAF2F8"/>
+            <w:shd w:fill="F2F2F2"/>
           </w:tcPr>
           <w:p>
             <w:pPr>
@@ -8594,7 +8594,7 @@
           <w:tcPr>
             <w:tcW w:type="dxa" w:w="2344"/>
             <w:vAlign w:val="center"/>
-            <w:shd w:fill="EAF2F8"/>
+            <w:shd w:fill="F2F2F2"/>
           </w:tcPr>
           <w:p>
             <w:pPr>
@@ -8615,7 +8615,7 @@
           <w:tcPr>
             <w:tcW w:type="dxa" w:w="2344"/>
             <w:vAlign w:val="center"/>
-            <w:shd w:fill="EAF2F8"/>
+            <w:shd w:fill="F2F2F2"/>
           </w:tcPr>
           <w:p>
             <w:pPr>
@@ -8636,7 +8636,7 @@
           <w:tcPr>
             <w:tcW w:type="dxa" w:w="2344"/>
             <w:vAlign w:val="center"/>
-            <w:shd w:fill="EAF2F8"/>
+            <w:shd w:fill="F2F2F2"/>
           </w:tcPr>
           <w:p>
             <w:pPr>
@@ -8657,7 +8657,7 @@
           <w:tcPr>
             <w:tcW w:type="dxa" w:w="2344"/>
             <w:vAlign w:val="center"/>
-            <w:shd w:fill="EAF2F8"/>
+            <w:shd w:fill="F2F2F2"/>
           </w:tcPr>
           <w:p>
             <w:pPr>
@@ -9751,7 +9751,7 @@
           <w:tcPr>
             <w:tcW w:type="dxa" w:w="3126"/>
             <w:vAlign w:val="center"/>
-            <w:shd w:fill="EAF2F8"/>
+            <w:shd w:fill="F2F2F2"/>
           </w:tcPr>
           <w:p>
             <w:pPr>
@@ -9772,7 +9772,7 @@
           <w:tcPr>
             <w:tcW w:type="dxa" w:w="3126"/>
             <w:vAlign w:val="center"/>
-            <w:shd w:fill="EAF2F8"/>
+            <w:shd w:fill="F2F2F2"/>
           </w:tcPr>
           <w:p>
             <w:pPr>
@@ -9793,7 +9793,7 @@
           <w:tcPr>
             <w:tcW w:type="dxa" w:w="3126"/>
             <w:vAlign w:val="center"/>
-            <w:shd w:fill="EAF2F8"/>
+            <w:shd w:fill="F2F2F2"/>
           </w:tcPr>
           <w:p>
             <w:pPr>
@@ -10445,7 +10445,7 @@
           <w:tcPr>
             <w:tcW w:type="dxa" w:w="2344"/>
             <w:vAlign w:val="center"/>
-            <w:shd w:fill="EAF2F8"/>
+            <w:shd w:fill="F2F2F2"/>
           </w:tcPr>
           <w:p>
             <w:pPr>
@@ -10466,7 +10466,7 @@
           <w:tcPr>
             <w:tcW w:type="dxa" w:w="2344"/>
             <w:vAlign w:val="center"/>
-            <w:shd w:fill="EAF2F8"/>
+            <w:shd w:fill="F2F2F2"/>
           </w:tcPr>
           <w:p>
             <w:pPr>
@@ -10487,7 +10487,7 @@
           <w:tcPr>
             <w:tcW w:type="dxa" w:w="2344"/>
             <w:vAlign w:val="center"/>
-            <w:shd w:fill="EAF2F8"/>
+            <w:shd w:fill="F2F2F2"/>
           </w:tcPr>
           <w:p>
             <w:pPr>
@@ -10508,7 +10508,7 @@
           <w:tcPr>
             <w:tcW w:type="dxa" w:w="2344"/>
             <w:vAlign w:val="center"/>
-            <w:shd w:fill="EAF2F8"/>
+            <w:shd w:fill="F2F2F2"/>
           </w:tcPr>
           <w:p>
             <w:pPr>
@@ -11861,7 +11861,7 @@
           <w:tcPr>
             <w:tcW w:type="dxa" w:w="1875"/>
             <w:vAlign w:val="center"/>
-            <w:shd w:fill="EAF2F8"/>
+            <w:shd w:fill="F2F2F2"/>
           </w:tcPr>
           <w:p>
             <w:pPr>
@@ -11882,7 +11882,7 @@
           <w:tcPr>
             <w:tcW w:type="dxa" w:w="1875"/>
             <w:vAlign w:val="center"/>
-            <w:shd w:fill="EAF2F8"/>
+            <w:shd w:fill="F2F2F2"/>
           </w:tcPr>
           <w:p>
             <w:pPr>
@@ -11903,7 +11903,7 @@
           <w:tcPr>
             <w:tcW w:type="dxa" w:w="1875"/>
             <w:vAlign w:val="center"/>
-            <w:shd w:fill="EAF2F8"/>
+            <w:shd w:fill="F2F2F2"/>
           </w:tcPr>
           <w:p>
             <w:pPr>
@@ -11924,7 +11924,7 @@
           <w:tcPr>
             <w:tcW w:type="dxa" w:w="1875"/>
             <w:vAlign w:val="center"/>
-            <w:shd w:fill="EAF2F8"/>
+            <w:shd w:fill="F2F2F2"/>
           </w:tcPr>
           <w:p>
             <w:pPr>
@@ -11945,7 +11945,7 @@
           <w:tcPr>
             <w:tcW w:type="dxa" w:w="1875"/>
             <w:vAlign w:val="center"/>
-            <w:shd w:fill="EAF2F8"/>
+            <w:shd w:fill="F2F2F2"/>
           </w:tcPr>
           <w:p>
             <w:pPr>

</xml_diff>